<commit_message>
party & custom packing invoice changes
</commit_message>
<xml_diff>
--- a/electron/database/generate-document/templates/custom-packing.docx
+++ b/electron/database/generate-document/templates/custom-packing.docx
@@ -10,10 +10,10 @@
         <w:tblLook w:val="04A0" w:firstRow="1" w:lastRow="0" w:firstColumn="1" w:lastColumn="0" w:noHBand="0" w:noVBand="1"/>
       </w:tblPr>
       <w:tblGrid>
-        <w:gridCol w:w="3005"/>
-        <w:gridCol w:w="2633"/>
-        <w:gridCol w:w="2783"/>
-        <w:gridCol w:w="2685"/>
+        <w:gridCol w:w="3291"/>
+        <w:gridCol w:w="2541"/>
+        <w:gridCol w:w="2684"/>
+        <w:gridCol w:w="2590"/>
       </w:tblGrid>
       <w:tr>
         <w:trPr>
@@ -1689,16 +1689,16 @@
               <w:tblLook w:val="04A0" w:firstRow="1" w:lastRow="0" w:firstColumn="1" w:lastColumn="0" w:noHBand="0" w:noVBand="1"/>
             </w:tblPr>
             <w:tblGrid>
+              <w:gridCol w:w="999"/>
+              <w:gridCol w:w="2164"/>
+              <w:gridCol w:w="606"/>
+              <w:gridCol w:w="1061"/>
+              <w:gridCol w:w="1023"/>
+              <w:gridCol w:w="955"/>
+              <w:gridCol w:w="841"/>
+              <w:gridCol w:w="976"/>
+              <w:gridCol w:w="1094"/>
               <w:gridCol w:w="1171"/>
-              <w:gridCol w:w="1470"/>
-              <w:gridCol w:w="691"/>
-              <w:gridCol w:w="1247"/>
-              <w:gridCol w:w="1201"/>
-              <w:gridCol w:w="1117"/>
-              <w:gridCol w:w="979"/>
-              <w:gridCol w:w="739"/>
-              <w:gridCol w:w="894"/>
-              <w:gridCol w:w="1381"/>
             </w:tblGrid>
             <w:tr>
               <w:trPr>
@@ -2066,29 +2066,7 @@
                       <w:sz w:val="20"/>
                       <w:szCs w:val="20"/>
                     </w:rPr>
-                    <w:t xml:space="preserve">Box Size </w:t>
-                  </w:r>
-                  <w:proofErr w:type="gramStart"/>
-                  <w:r>
-                    <w:rPr>
-                      <w:rFonts w:cstheme="minorHAnsi"/>
-                      <w:b/>
-                      <w:bCs/>
-                      <w:sz w:val="20"/>
-                      <w:szCs w:val="20"/>
-                    </w:rPr>
-                    <w:t>In</w:t>
-                  </w:r>
-                  <w:proofErr w:type="gramEnd"/>
-                  <w:r>
-                    <w:rPr>
-                      <w:rFonts w:cstheme="minorHAnsi"/>
-                      <w:b/>
-                      <w:bCs/>
-                      <w:sz w:val="20"/>
-                      <w:szCs w:val="20"/>
-                    </w:rPr>
-                    <w:t xml:space="preserve"> Inch</w:t>
+                    <w:t>Box Size In Inch</w:t>
                   </w:r>
                 </w:p>
               </w:tc>
@@ -2127,7 +2105,6 @@
                     </w:rPr>
                     <w:t>{#</w:t>
                   </w:r>
-                  <w:proofErr w:type="gramStart"/>
                   <w:r>
                     <w:rPr>
                       <w:rFonts w:cstheme="minorHAnsi"/>
@@ -2152,18 +2129,7 @@
                       <w:sz w:val="20"/>
                       <w:szCs w:val="20"/>
                     </w:rPr>
-                    <w:t>{</w:t>
-                  </w:r>
-                  <w:proofErr w:type="gramEnd"/>
-                  <w:r>
-                    <w:rPr>
-                      <w:rFonts w:cstheme="minorHAnsi"/>
-                      <w:b/>
-                      <w:bCs/>
-                      <w:sz w:val="20"/>
-                      <w:szCs w:val="20"/>
-                    </w:rPr>
-                    <w:t>thicknessDetail}</w:t>
+                    <w:t>{thicknessDetail}</w:t>
                   </w:r>
                 </w:p>
                 <w:p>
@@ -2374,7 +2340,25 @@
                       <w:sz w:val="20"/>
                       <w:szCs w:val="20"/>
                     </w:rPr>
-                    <w:t>} to {</w:t>
+                    <w:t>}{#containerTo} to {</w:t>
+                  </w:r>
+                  <w:proofErr w:type="spellStart"/>
+                  <w:r>
+                    <w:rPr>
+                      <w:rFonts w:cstheme="minorHAnsi"/>
+                      <w:sz w:val="20"/>
+                      <w:szCs w:val="20"/>
+                    </w:rPr>
+                    <w:t>containerTo</w:t>
+                  </w:r>
+                  <w:proofErr w:type="spellEnd"/>
+                  <w:r>
+                    <w:rPr>
+                      <w:rFonts w:cstheme="minorHAnsi"/>
+                      <w:sz w:val="20"/>
+                      <w:szCs w:val="20"/>
+                    </w:rPr>
+                    <w:t>}{/</w:t>
                   </w:r>
                   <w:proofErr w:type="spellStart"/>
                   <w:r>
@@ -2625,6 +2609,32 @@
                       <w:szCs w:val="20"/>
                     </w:rPr>
                   </w:pPr>
+                  <w:r>
+                    <w:rPr>
+                      <w:rFonts w:cstheme="minorHAnsi"/>
+                      <w:sz w:val="20"/>
+                      <w:szCs w:val="20"/>
+                    </w:rPr>
+                    <w:t>{</w:t>
+                  </w:r>
+                  <w:proofErr w:type="spellStart"/>
+                  <w:r>
+                    <w:rPr>
+                      <w:rFonts w:cstheme="minorHAnsi"/>
+                      <w:sz w:val="20"/>
+                      <w:szCs w:val="20"/>
+                    </w:rPr>
+                    <w:t>netWeight</w:t>
+                  </w:r>
+                  <w:proofErr w:type="spellEnd"/>
+                  <w:r>
+                    <w:rPr>
+                      <w:rFonts w:cstheme="minorHAnsi"/>
+                      <w:sz w:val="20"/>
+                      <w:szCs w:val="20"/>
+                    </w:rPr>
+                    <w:t>}</w:t>
+                  </w:r>
                 </w:p>
               </w:tc>
               <w:tc>
@@ -2646,6 +2656,32 @@
                       <w:szCs w:val="20"/>
                     </w:rPr>
                   </w:pPr>
+                  <w:r>
+                    <w:rPr>
+                      <w:rFonts w:cstheme="minorHAnsi"/>
+                      <w:sz w:val="20"/>
+                      <w:szCs w:val="20"/>
+                    </w:rPr>
+                    <w:t>{</w:t>
+                  </w:r>
+                  <w:proofErr w:type="spellStart"/>
+                  <w:r>
+                    <w:rPr>
+                      <w:rFonts w:cstheme="minorHAnsi"/>
+                      <w:sz w:val="20"/>
+                      <w:szCs w:val="20"/>
+                    </w:rPr>
+                    <w:t>grossWeight</w:t>
+                  </w:r>
+                  <w:proofErr w:type="spellEnd"/>
+                  <w:r>
+                    <w:rPr>
+                      <w:rFonts w:cstheme="minorHAnsi"/>
+                      <w:sz w:val="20"/>
+                      <w:szCs w:val="20"/>
+                    </w:rPr>
+                    <w:t>}</w:t>
+                  </w:r>
                 </w:p>
               </w:tc>
               <w:tc>
@@ -3034,6 +3070,38 @@
                       <w:sz w:val="20"/>
                       <w:szCs w:val="20"/>
                     </w:rPr>
+                    <w:t>{</w:t>
+                  </w:r>
+                  <w:proofErr w:type="spellStart"/>
+                  <w:r>
+                    <w:rPr>
+                      <w:rFonts w:cstheme="minorHAnsi"/>
+                      <w:b/>
+                      <w:bCs/>
+                      <w:sz w:val="20"/>
+                      <w:szCs w:val="20"/>
+                    </w:rPr>
+                    <w:t>totalNetWeight</w:t>
+                  </w:r>
+                  <w:proofErr w:type="spellEnd"/>
+                  <w:r>
+                    <w:rPr>
+                      <w:rFonts w:cstheme="minorHAnsi"/>
+                      <w:b/>
+                      <w:bCs/>
+                      <w:sz w:val="20"/>
+                      <w:szCs w:val="20"/>
+                    </w:rPr>
+                    <w:t xml:space="preserve">} </w:t>
+                  </w:r>
+                  <w:r>
+                    <w:rPr>
+                      <w:rFonts w:cstheme="minorHAnsi"/>
+                      <w:b/>
+                      <w:bCs/>
+                      <w:sz w:val="20"/>
+                      <w:szCs w:val="20"/>
+                    </w:rPr>
                     <w:t>Kg</w:t>
                   </w:r>
                   <w:r>
@@ -3109,6 +3177,38 @@
                       <w:sz w:val="20"/>
                       <w:szCs w:val="20"/>
                     </w:rPr>
+                    <w:t>{</w:t>
+                  </w:r>
+                  <w:proofErr w:type="spellStart"/>
+                  <w:r>
+                    <w:rPr>
+                      <w:rFonts w:cstheme="minorHAnsi"/>
+                      <w:b/>
+                      <w:bCs/>
+                      <w:sz w:val="20"/>
+                      <w:szCs w:val="20"/>
+                    </w:rPr>
+                    <w:t>totalGrossWeight</w:t>
+                  </w:r>
+                  <w:proofErr w:type="spellEnd"/>
+                  <w:r>
+                    <w:rPr>
+                      <w:rFonts w:cstheme="minorHAnsi"/>
+                      <w:b/>
+                      <w:bCs/>
+                      <w:sz w:val="20"/>
+                      <w:szCs w:val="20"/>
+                    </w:rPr>
+                    <w:t xml:space="preserve">} </w:t>
+                  </w:r>
+                  <w:r>
+                    <w:rPr>
+                      <w:rFonts w:cstheme="minorHAnsi"/>
+                      <w:b/>
+                      <w:bCs/>
+                      <w:sz w:val="20"/>
+                      <w:szCs w:val="20"/>
+                    </w:rPr>
                     <w:t>Kg</w:t>
                   </w:r>
                 </w:p>
@@ -3148,7 +3248,6 @@
                     <w:t xml:space="preserve">Total </w:t>
                   </w:r>
                   <w:proofErr w:type="spellStart"/>
-                  <w:proofErr w:type="gramStart"/>
                   <w:r>
                     <w:rPr>
                       <w:rFonts w:cstheme="minorHAnsi"/>
@@ -3160,7 +3259,6 @@
                     <w:t>Sq.Meter</w:t>
                   </w:r>
                   <w:proofErr w:type="spellEnd"/>
-                  <w:proofErr w:type="gramEnd"/>
                   <w:r>
                     <w:rPr>
                       <w:rFonts w:cstheme="minorHAnsi"/>
@@ -3316,29 +3414,7 @@
                       <w:sz w:val="20"/>
                       <w:szCs w:val="20"/>
                     </w:rPr>
-                    <w:t>Avg./</w:t>
-                  </w:r>
-                  <w:proofErr w:type="gramStart"/>
-                  <w:r>
-                    <w:rPr>
-                      <w:rFonts w:cstheme="minorHAnsi"/>
-                      <w:b/>
-                      <w:bCs/>
-                      <w:sz w:val="20"/>
-                      <w:szCs w:val="20"/>
-                    </w:rPr>
-                    <w:t>Wt.(</w:t>
-                  </w:r>
-                  <w:proofErr w:type="gramEnd"/>
-                  <w:r>
-                    <w:rPr>
-                      <w:rFonts w:cstheme="minorHAnsi"/>
-                      <w:b/>
-                      <w:bCs/>
-                      <w:sz w:val="20"/>
-                      <w:szCs w:val="20"/>
-                    </w:rPr>
-                    <w:t>Kg)</w:t>
+                    <w:t>Avg./Wt.(Kg)</w:t>
                   </w:r>
                 </w:p>
               </w:tc>
@@ -3434,29 +3510,7 @@
                       <w:sz w:val="20"/>
                       <w:szCs w:val="20"/>
                     </w:rPr>
-                    <w:t>{#</w:t>
-                  </w:r>
-                  <w:proofErr w:type="gramStart"/>
-                  <w:r>
-                    <w:rPr>
-                      <w:rFonts w:cstheme="minorHAnsi"/>
-                      <w:b/>
-                      <w:bCs/>
-                      <w:sz w:val="20"/>
-                      <w:szCs w:val="20"/>
-                    </w:rPr>
-                    <w:t>containerSummary}{</w:t>
-                  </w:r>
-                  <w:proofErr w:type="gramEnd"/>
-                  <w:r>
-                    <w:rPr>
-                      <w:rFonts w:cstheme="minorHAnsi"/>
-                      <w:b/>
-                      <w:bCs/>
-                      <w:sz w:val="20"/>
-                      <w:szCs w:val="20"/>
-                    </w:rPr>
-                    <w:t>avgWeight}</w:t>
+                    <w:t>{#containerSummary}{avgWeight}</w:t>
                   </w:r>
                 </w:p>
               </w:tc>

</xml_diff>

<commit_message>
text area bug fix
</commit_message>
<xml_diff>
--- a/electron/database/generate-document/templates/custom-packing.docx
+++ b/electron/database/generate-document/templates/custom-packing.docx
@@ -10,10 +10,10 @@
         <w:tblLook w:val="04A0" w:firstRow="1" w:lastRow="0" w:firstColumn="1" w:lastColumn="0" w:noHBand="0" w:noVBand="1"/>
       </w:tblPr>
       <w:tblGrid>
-        <w:gridCol w:w="3770"/>
-        <w:gridCol w:w="2387"/>
-        <w:gridCol w:w="2517"/>
-        <w:gridCol w:w="2432"/>
+        <w:gridCol w:w="4186"/>
+        <w:gridCol w:w="2257"/>
+        <w:gridCol w:w="2382"/>
+        <w:gridCol w:w="2281"/>
       </w:tblGrid>
       <w:tr>
         <w:trPr>
@@ -21,7 +21,7 @@
         </w:trPr>
         <w:tc>
           <w:tcPr>
-            <w:tcW w:w="5622" w:type="dxa"/>
+            <w:tcW w:w="6157" w:type="dxa"/>
             <w:gridSpan w:val="2"/>
             <w:vMerge w:val="restart"/>
             <w:tcBorders>
@@ -186,7 +186,7 @@
         </w:tc>
         <w:tc>
           <w:tcPr>
-            <w:tcW w:w="2769" w:type="dxa"/>
+            <w:tcW w:w="2517" w:type="dxa"/>
           </w:tcPr>
           <w:p>
             <w:pPr>
@@ -213,14 +213,12 @@
               </w:rPr>
               <w:t>{</w:t>
             </w:r>
-            <w:proofErr w:type="spellStart"/>
             <w:r>
               <w:rPr>
                 <w:rFonts w:cstheme="minorHAnsi"/>
               </w:rPr>
               <w:t>invoiceNo</w:t>
             </w:r>
-            <w:proofErr w:type="spellEnd"/>
             <w:r>
               <w:rPr>
                 <w:rFonts w:cstheme="minorHAnsi"/>
@@ -231,7 +229,7 @@
         </w:tc>
         <w:tc>
           <w:tcPr>
-            <w:tcW w:w="2715" w:type="dxa"/>
+            <w:tcW w:w="2432" w:type="dxa"/>
             <w:tcBorders>
               <w:right w:val="nil"/>
             </w:tcBorders>
@@ -261,14 +259,12 @@
               </w:rPr>
               <w:t>{</w:t>
             </w:r>
-            <w:proofErr w:type="spellStart"/>
             <w:r>
               <w:rPr>
                 <w:rFonts w:cstheme="minorHAnsi"/>
               </w:rPr>
               <w:t>invoiceDate</w:t>
             </w:r>
-            <w:proofErr w:type="spellEnd"/>
             <w:r>
               <w:rPr>
                 <w:rFonts w:cstheme="minorHAnsi"/>
@@ -284,7 +280,7 @@
         </w:trPr>
         <w:tc>
           <w:tcPr>
-            <w:tcW w:w="5622" w:type="dxa"/>
+            <w:tcW w:w="6157" w:type="dxa"/>
             <w:gridSpan w:val="2"/>
             <w:vMerge/>
             <w:tcBorders>
@@ -301,7 +297,7 @@
         </w:tc>
         <w:tc>
           <w:tcPr>
-            <w:tcW w:w="2769" w:type="dxa"/>
+            <w:tcW w:w="2517" w:type="dxa"/>
             <w:tcBorders>
               <w:bottom w:val="single" w:sz="4" w:space="0" w:color="auto"/>
             </w:tcBorders>
@@ -331,14 +327,12 @@
               </w:rPr>
               <w:t>{</w:t>
             </w:r>
-            <w:proofErr w:type="spellStart"/>
             <w:r>
               <w:rPr>
                 <w:rFonts w:cstheme="minorHAnsi"/>
               </w:rPr>
               <w:t>buyersOrderNo</w:t>
             </w:r>
-            <w:proofErr w:type="spellEnd"/>
             <w:r>
               <w:rPr>
                 <w:rFonts w:cstheme="minorHAnsi"/>
@@ -349,7 +343,7 @@
         </w:tc>
         <w:tc>
           <w:tcPr>
-            <w:tcW w:w="2715" w:type="dxa"/>
+            <w:tcW w:w="2432" w:type="dxa"/>
             <w:tcBorders>
               <w:bottom w:val="single" w:sz="4" w:space="0" w:color="auto"/>
               <w:right w:val="nil"/>
@@ -380,14 +374,12 @@
               </w:rPr>
               <w:t>{</w:t>
             </w:r>
-            <w:proofErr w:type="spellStart"/>
             <w:r>
               <w:rPr>
                 <w:rFonts w:cstheme="minorHAnsi"/>
               </w:rPr>
               <w:t>orderDate</w:t>
             </w:r>
-            <w:proofErr w:type="spellEnd"/>
             <w:r>
               <w:rPr>
                 <w:rFonts w:cstheme="minorHAnsi"/>
@@ -403,7 +395,7 @@
         </w:trPr>
         <w:tc>
           <w:tcPr>
-            <w:tcW w:w="5622" w:type="dxa"/>
+            <w:tcW w:w="6157" w:type="dxa"/>
             <w:gridSpan w:val="2"/>
             <w:vMerge w:val="restart"/>
             <w:tcBorders>
@@ -444,7 +436,6 @@
               </w:rPr>
               <w:t>{</w:t>
             </w:r>
-            <w:proofErr w:type="spellStart"/>
             <w:r>
               <w:rPr>
                 <w:rFonts w:cstheme="minorHAnsi"/>
@@ -453,7 +444,6 @@
               </w:rPr>
               <w:t>consigneeCountry</w:t>
             </w:r>
-            <w:proofErr w:type="spellEnd"/>
             <w:r>
               <w:rPr>
                 <w:rFonts w:cstheme="minorHAnsi"/>
@@ -522,7 +512,6 @@
               </w:rPr>
               <w:t>{</w:t>
             </w:r>
-            <w:proofErr w:type="spellStart"/>
             <w:r>
               <w:rPr>
                 <w:rFonts w:cstheme="minorHAnsi"/>
@@ -531,7 +520,6 @@
               </w:rPr>
               <w:t>consigneeName</w:t>
             </w:r>
-            <w:proofErr w:type="spellEnd"/>
             <w:r>
               <w:rPr>
                 <w:rFonts w:cstheme="minorHAnsi"/>
@@ -557,7 +545,6 @@
               </w:rPr>
               <w:t>{</w:t>
             </w:r>
-            <w:proofErr w:type="spellStart"/>
             <w:r>
               <w:rPr>
                 <w:rFonts w:cstheme="minorHAnsi"/>
@@ -566,7 +553,6 @@
               </w:rPr>
               <w:t>consigneeAddress</w:t>
             </w:r>
-            <w:proofErr w:type="spellEnd"/>
             <w:r>
               <w:rPr>
                 <w:rFonts w:cstheme="minorHAnsi"/>
@@ -575,7 +561,6 @@
               </w:rPr>
               <w:t>} {</w:t>
             </w:r>
-            <w:proofErr w:type="spellStart"/>
             <w:r>
               <w:rPr>
                 <w:rFonts w:cstheme="minorHAnsi"/>
@@ -584,7 +569,6 @@
               </w:rPr>
               <w:t>consigneeCity</w:t>
             </w:r>
-            <w:proofErr w:type="spellEnd"/>
             <w:r>
               <w:rPr>
                 <w:rFonts w:cstheme="minorHAnsi"/>
@@ -593,7 +577,6 @@
               </w:rPr>
               <w:t>} {</w:t>
             </w:r>
-            <w:proofErr w:type="spellStart"/>
             <w:r>
               <w:rPr>
                 <w:rFonts w:cstheme="minorHAnsi"/>
@@ -602,7 +585,6 @@
               </w:rPr>
               <w:t>consigneeState</w:t>
             </w:r>
-            <w:proofErr w:type="spellEnd"/>
             <w:r>
               <w:rPr>
                 <w:rFonts w:cstheme="minorHAnsi"/>
@@ -628,7 +610,6 @@
               </w:rPr>
               <w:t>{</w:t>
             </w:r>
-            <w:proofErr w:type="spellStart"/>
             <w:r>
               <w:rPr>
                 <w:rFonts w:cstheme="minorHAnsi"/>
@@ -637,7 +618,6 @@
               </w:rPr>
               <w:t>consigneeCountry</w:t>
             </w:r>
-            <w:proofErr w:type="spellEnd"/>
             <w:r>
               <w:rPr>
                 <w:rFonts w:cstheme="minorHAnsi"/>
@@ -646,7 +626,6 @@
               </w:rPr>
               <w:t>} {</w:t>
             </w:r>
-            <w:proofErr w:type="spellStart"/>
             <w:r>
               <w:rPr>
                 <w:rFonts w:cstheme="minorHAnsi"/>
@@ -655,7 +634,6 @@
               </w:rPr>
               <w:t>consigneeZip</w:t>
             </w:r>
-            <w:proofErr w:type="spellEnd"/>
             <w:r>
               <w:rPr>
                 <w:rFonts w:cstheme="minorHAnsi"/>
@@ -668,7 +646,7 @@
         </w:tc>
         <w:tc>
           <w:tcPr>
-            <w:tcW w:w="5484" w:type="dxa"/>
+            <w:tcW w:w="4949" w:type="dxa"/>
             <w:gridSpan w:val="2"/>
             <w:tcBorders>
               <w:left w:val="single" w:sz="4" w:space="0" w:color="auto"/>
@@ -708,7 +686,6 @@
               </w:rPr>
               <w:t>{</w:t>
             </w:r>
-            <w:proofErr w:type="spellStart"/>
             <w:r>
               <w:rPr>
                 <w:rFonts w:cstheme="minorHAnsi"/>
@@ -717,7 +694,6 @@
               </w:rPr>
               <w:t>buyerName</w:t>
             </w:r>
-            <w:proofErr w:type="spellEnd"/>
             <w:r>
               <w:rPr>
                 <w:rFonts w:cstheme="minorHAnsi"/>
@@ -743,7 +719,6 @@
               </w:rPr>
               <w:t>{</w:t>
             </w:r>
-            <w:proofErr w:type="spellStart"/>
             <w:r>
               <w:rPr>
                 <w:rFonts w:cstheme="minorHAnsi"/>
@@ -752,7 +727,6 @@
               </w:rPr>
               <w:t>buyerAddress</w:t>
             </w:r>
-            <w:proofErr w:type="spellEnd"/>
             <w:r>
               <w:rPr>
                 <w:rFonts w:cstheme="minorHAnsi"/>
@@ -761,7 +735,6 @@
               </w:rPr>
               <w:t>} {</w:t>
             </w:r>
-            <w:proofErr w:type="spellStart"/>
             <w:r>
               <w:rPr>
                 <w:rFonts w:cstheme="minorHAnsi"/>
@@ -770,7 +743,6 @@
               </w:rPr>
               <w:t>buyerCity</w:t>
             </w:r>
-            <w:proofErr w:type="spellEnd"/>
             <w:r>
               <w:rPr>
                 <w:rFonts w:cstheme="minorHAnsi"/>
@@ -779,7 +751,6 @@
               </w:rPr>
               <w:t>} {</w:t>
             </w:r>
-            <w:proofErr w:type="spellStart"/>
             <w:r>
               <w:rPr>
                 <w:rFonts w:cstheme="minorHAnsi"/>
@@ -788,7 +759,6 @@
               </w:rPr>
               <w:t>buyerState</w:t>
             </w:r>
-            <w:proofErr w:type="spellEnd"/>
             <w:r>
               <w:rPr>
                 <w:rFonts w:cstheme="minorHAnsi"/>
@@ -814,7 +784,6 @@
               </w:rPr>
               <w:t>{</w:t>
             </w:r>
-            <w:proofErr w:type="spellStart"/>
             <w:r>
               <w:rPr>
                 <w:rFonts w:cstheme="minorHAnsi"/>
@@ -823,7 +792,6 @@
               </w:rPr>
               <w:t>buyerCountry</w:t>
             </w:r>
-            <w:proofErr w:type="spellEnd"/>
             <w:r>
               <w:rPr>
                 <w:rFonts w:cstheme="minorHAnsi"/>
@@ -832,7 +800,6 @@
               </w:rPr>
               <w:t>} {</w:t>
             </w:r>
-            <w:proofErr w:type="spellStart"/>
             <w:r>
               <w:rPr>
                 <w:rFonts w:cstheme="minorHAnsi"/>
@@ -841,7 +808,6 @@
               </w:rPr>
               <w:t>buyerZip</w:t>
             </w:r>
-            <w:proofErr w:type="spellEnd"/>
             <w:r>
               <w:rPr>
                 <w:rFonts w:cstheme="minorHAnsi"/>
@@ -859,7 +825,7 @@
         </w:trPr>
         <w:tc>
           <w:tcPr>
-            <w:tcW w:w="5622" w:type="dxa"/>
+            <w:tcW w:w="6157" w:type="dxa"/>
             <w:gridSpan w:val="2"/>
             <w:vMerge/>
             <w:tcBorders>
@@ -878,7 +844,7 @@
         </w:tc>
         <w:tc>
           <w:tcPr>
-            <w:tcW w:w="2769" w:type="dxa"/>
+            <w:tcW w:w="2517" w:type="dxa"/>
           </w:tcPr>
           <w:p>
             <w:pPr>
@@ -913,7 +879,6 @@
               </w:rPr>
               <w:t>{</w:t>
             </w:r>
-            <w:proofErr w:type="spellStart"/>
             <w:r>
               <w:rPr>
                 <w:rFonts w:cstheme="minorHAnsi"/>
@@ -922,7 +887,6 @@
               </w:rPr>
               <w:t>originOfGoods</w:t>
             </w:r>
-            <w:proofErr w:type="spellEnd"/>
             <w:r>
               <w:rPr>
                 <w:rFonts w:cstheme="minorHAnsi"/>
@@ -935,7 +899,7 @@
         </w:tc>
         <w:tc>
           <w:tcPr>
-            <w:tcW w:w="2715" w:type="dxa"/>
+            <w:tcW w:w="2432" w:type="dxa"/>
             <w:tcBorders>
               <w:right w:val="nil"/>
             </w:tcBorders>
@@ -973,7 +937,6 @@
               </w:rPr>
               <w:t>{</w:t>
             </w:r>
-            <w:proofErr w:type="spellStart"/>
             <w:r>
               <w:rPr>
                 <w:rFonts w:cstheme="minorHAnsi"/>
@@ -982,7 +945,6 @@
               </w:rPr>
               <w:t>finalDestination</w:t>
             </w:r>
-            <w:proofErr w:type="spellEnd"/>
             <w:r>
               <w:rPr>
                 <w:rFonts w:cstheme="minorHAnsi"/>
@@ -1000,7 +962,7 @@
         </w:trPr>
         <w:tc>
           <w:tcPr>
-            <w:tcW w:w="5622" w:type="dxa"/>
+            <w:tcW w:w="6157" w:type="dxa"/>
             <w:gridSpan w:val="2"/>
             <w:vMerge/>
             <w:tcBorders>
@@ -1019,7 +981,7 @@
         </w:tc>
         <w:tc>
           <w:tcPr>
-            <w:tcW w:w="5484" w:type="dxa"/>
+            <w:tcW w:w="4949" w:type="dxa"/>
             <w:gridSpan w:val="2"/>
             <w:vMerge w:val="restart"/>
             <w:tcBorders>
@@ -1059,7 +1021,6 @@
               </w:rPr>
               <w:t>{</w:t>
             </w:r>
-            <w:proofErr w:type="spellStart"/>
             <w:r>
               <w:rPr>
                 <w:rFonts w:cstheme="minorHAnsi"/>
@@ -1068,7 +1029,6 @@
               </w:rPr>
               <w:t>termOfDeliveryAndPayment</w:t>
             </w:r>
-            <w:proofErr w:type="spellEnd"/>
             <w:r>
               <w:rPr>
                 <w:rFonts w:cstheme="minorHAnsi"/>
@@ -1086,7 +1046,7 @@
         </w:trPr>
         <w:tc>
           <w:tcPr>
-            <w:tcW w:w="2991" w:type="dxa"/>
+            <w:tcW w:w="3770" w:type="dxa"/>
             <w:tcBorders>
               <w:left w:val="nil"/>
             </w:tcBorders>
@@ -1104,7 +1064,6 @@
                 <w:szCs w:val="20"/>
               </w:rPr>
             </w:pPr>
-            <w:proofErr w:type="spellStart"/>
             <w:r>
               <w:rPr>
                 <w:rFonts w:ascii="SansSerif" w:hAnsi="SansSerif" w:cs="SansSerif"/>
@@ -1112,17 +1071,7 @@
                 <w:sz w:val="20"/>
                 <w:szCs w:val="20"/>
               </w:rPr>
-              <w:t>Precarriage</w:t>
-            </w:r>
-            <w:proofErr w:type="spellEnd"/>
-            <w:r>
-              <w:rPr>
-                <w:rFonts w:ascii="SansSerif" w:hAnsi="SansSerif" w:cs="SansSerif"/>
-                <w:color w:val="000000"/>
-                <w:sz w:val="20"/>
-                <w:szCs w:val="20"/>
-              </w:rPr>
-              <w:t xml:space="preserve"> by:</w:t>
+              <w:t>Precarriage by:</w:t>
             </w:r>
           </w:p>
           <w:p>
@@ -1142,7 +1091,6 @@
               </w:rPr>
               <w:t>{</w:t>
             </w:r>
-            <w:proofErr w:type="spellStart"/>
             <w:r>
               <w:rPr>
                 <w:rFonts w:cstheme="minorHAnsi"/>
@@ -1151,7 +1099,6 @@
               </w:rPr>
               <w:t>precarriageBy</w:t>
             </w:r>
-            <w:proofErr w:type="spellEnd"/>
             <w:r>
               <w:rPr>
                 <w:rFonts w:cstheme="minorHAnsi"/>
@@ -1164,7 +1111,7 @@
         </w:tc>
         <w:tc>
           <w:tcPr>
-            <w:tcW w:w="2631" w:type="dxa"/>
+            <w:tcW w:w="2387" w:type="dxa"/>
           </w:tcPr>
           <w:p>
             <w:pPr>
@@ -1212,7 +1159,6 @@
               </w:rPr>
               <w:t>{</w:t>
             </w:r>
-            <w:proofErr w:type="spellStart"/>
             <w:r>
               <w:rPr>
                 <w:rFonts w:ascii="SansSerif" w:hAnsi="SansSerif" w:cs="SansSerif"/>
@@ -1222,7 +1168,6 @@
               </w:rPr>
               <w:t>placeOfReceipt</w:t>
             </w:r>
-            <w:proofErr w:type="spellEnd"/>
             <w:r>
               <w:rPr>
                 <w:rFonts w:ascii="SansSerif" w:hAnsi="SansSerif" w:cs="SansSerif"/>
@@ -1236,7 +1181,7 @@
         </w:tc>
         <w:tc>
           <w:tcPr>
-            <w:tcW w:w="5484" w:type="dxa"/>
+            <w:tcW w:w="4949" w:type="dxa"/>
             <w:gridSpan w:val="2"/>
             <w:vMerge/>
             <w:tcBorders>
@@ -1260,7 +1205,7 @@
         </w:trPr>
         <w:tc>
           <w:tcPr>
-            <w:tcW w:w="2991" w:type="dxa"/>
+            <w:tcW w:w="3770" w:type="dxa"/>
             <w:tcBorders>
               <w:left w:val="nil"/>
             </w:tcBorders>
@@ -1312,7 +1257,6 @@
               </w:rPr>
               <w:t>{</w:t>
             </w:r>
-            <w:proofErr w:type="spellStart"/>
             <w:r>
               <w:rPr>
                 <w:rFonts w:ascii="SansSerif" w:hAnsi="SansSerif" w:cs="SansSerif"/>
@@ -1322,7 +1266,6 @@
               </w:rPr>
               <w:t>vesselNo</w:t>
             </w:r>
-            <w:proofErr w:type="spellEnd"/>
             <w:r>
               <w:rPr>
                 <w:rFonts w:ascii="SansSerif" w:hAnsi="SansSerif" w:cs="SansSerif"/>
@@ -1336,7 +1279,7 @@
         </w:tc>
         <w:tc>
           <w:tcPr>
-            <w:tcW w:w="2631" w:type="dxa"/>
+            <w:tcW w:w="2387" w:type="dxa"/>
           </w:tcPr>
           <w:p>
             <w:pPr>
@@ -1384,7 +1327,6 @@
               </w:rPr>
               <w:t>{</w:t>
             </w:r>
-            <w:proofErr w:type="spellStart"/>
             <w:r>
               <w:rPr>
                 <w:rFonts w:ascii="SansSerif" w:hAnsi="SansSerif" w:cs="SansSerif"/>
@@ -1394,7 +1336,6 @@
               </w:rPr>
               <w:t>portOfLoading</w:t>
             </w:r>
-            <w:proofErr w:type="spellEnd"/>
             <w:r>
               <w:rPr>
                 <w:rFonts w:ascii="SansSerif" w:hAnsi="SansSerif" w:cs="SansSerif"/>
@@ -1408,7 +1349,7 @@
         </w:tc>
         <w:tc>
           <w:tcPr>
-            <w:tcW w:w="5484" w:type="dxa"/>
+            <w:tcW w:w="4949" w:type="dxa"/>
             <w:gridSpan w:val="2"/>
             <w:vMerge/>
             <w:tcBorders>
@@ -1432,7 +1373,7 @@
         </w:trPr>
         <w:tc>
           <w:tcPr>
-            <w:tcW w:w="2991" w:type="dxa"/>
+            <w:tcW w:w="3770" w:type="dxa"/>
             <w:tcBorders>
               <w:left w:val="nil"/>
             </w:tcBorders>
@@ -1479,7 +1420,6 @@
               </w:rPr>
               <w:t>{</w:t>
             </w:r>
-            <w:proofErr w:type="spellStart"/>
             <w:r>
               <w:rPr>
                 <w:rFonts w:ascii="SansSerif" w:hAnsi="SansSerif" w:cs="SansSerif"/>
@@ -1489,7 +1429,6 @@
               </w:rPr>
               <w:t>portOfDischarge</w:t>
             </w:r>
-            <w:proofErr w:type="spellEnd"/>
             <w:r>
               <w:rPr>
                 <w:rFonts w:ascii="SansSerif" w:hAnsi="SansSerif" w:cs="SansSerif"/>
@@ -1503,7 +1442,7 @@
         </w:tc>
         <w:tc>
           <w:tcPr>
-            <w:tcW w:w="2631" w:type="dxa"/>
+            <w:tcW w:w="2387" w:type="dxa"/>
           </w:tcPr>
           <w:p>
             <w:pPr>
@@ -1547,7 +1486,6 @@
               </w:rPr>
               <w:t>{</w:t>
             </w:r>
-            <w:proofErr w:type="spellStart"/>
             <w:r>
               <w:rPr>
                 <w:rFonts w:ascii="SansSerif" w:hAnsi="SansSerif" w:cs="SansSerif"/>
@@ -1557,7 +1495,6 @@
               </w:rPr>
               <w:t>finalDestination</w:t>
             </w:r>
-            <w:proofErr w:type="spellEnd"/>
             <w:r>
               <w:rPr>
                 <w:rFonts w:ascii="SansSerif" w:hAnsi="SansSerif" w:cs="SansSerif"/>
@@ -1571,7 +1508,7 @@
         </w:tc>
         <w:tc>
           <w:tcPr>
-            <w:tcW w:w="5484" w:type="dxa"/>
+            <w:tcW w:w="4949" w:type="dxa"/>
             <w:gridSpan w:val="2"/>
             <w:vMerge/>
             <w:tcBorders>
@@ -1628,7 +1565,6 @@
               </w:rPr>
               <w:t>{</w:t>
             </w:r>
-            <w:proofErr w:type="spellStart"/>
             <w:r>
               <w:rPr>
                 <w:rFonts w:cstheme="minorHAnsi"/>
@@ -1637,7 +1573,6 @@
               </w:rPr>
               <w:t>privateRemark</w:t>
             </w:r>
-            <w:proofErr w:type="spellEnd"/>
             <w:r>
               <w:rPr>
                 <w:rFonts w:cstheme="minorHAnsi"/>
@@ -1775,119 +1710,7 @@
                       <w:sz w:val="20"/>
                       <w:szCs w:val="20"/>
                     </w:rPr>
-                    <w:t>{#</w:t>
-                  </w:r>
-                  <w:proofErr w:type="gramStart"/>
-                  <w:r>
-                    <w:rPr>
-                      <w:rFonts w:cstheme="minorHAnsi"/>
-                      <w:b/>
-                      <w:bCs/>
-                      <w:sz w:val="20"/>
-                      <w:szCs w:val="20"/>
-                    </w:rPr>
-                    <w:t>isAus}ASW</w:t>
-                  </w:r>
-                  <w:proofErr w:type="gramEnd"/>
-                  <w:r>
-                    <w:rPr>
-                      <w:rFonts w:cstheme="minorHAnsi"/>
-                      <w:b/>
-                      <w:bCs/>
-                      <w:sz w:val="20"/>
-                      <w:szCs w:val="20"/>
-                    </w:rPr>
-                    <w:t xml:space="preserve"> No{/</w:t>
-                  </w:r>
-                  <w:proofErr w:type="spellStart"/>
-                  <w:proofErr w:type="gramStart"/>
-                  <w:r>
-                    <w:rPr>
-                      <w:rFonts w:cstheme="minorHAnsi"/>
-                      <w:b/>
-                      <w:bCs/>
-                      <w:sz w:val="20"/>
-                      <w:szCs w:val="20"/>
-                    </w:rPr>
-                    <w:t>isAus</w:t>
-                  </w:r>
-                  <w:proofErr w:type="spellEnd"/>
-                  <w:r>
-                    <w:rPr>
-                      <w:rFonts w:cstheme="minorHAnsi"/>
-                      <w:b/>
-                      <w:bCs/>
-                      <w:sz w:val="20"/>
-                      <w:szCs w:val="20"/>
-                    </w:rPr>
-                    <w:t>}{</w:t>
-                  </w:r>
-                  <w:proofErr w:type="gramEnd"/>
-                  <w:r>
-                    <w:rPr>
-                      <w:rFonts w:cstheme="minorHAnsi"/>
-                      <w:b/>
-                      <w:bCs/>
-                      <w:sz w:val="20"/>
-                      <w:szCs w:val="20"/>
-                    </w:rPr>
-                    <w:t>^</w:t>
-                  </w:r>
-                  <w:proofErr w:type="spellStart"/>
-                  <w:proofErr w:type="gramStart"/>
-                  <w:r>
-                    <w:rPr>
-                      <w:rFonts w:cstheme="minorHAnsi"/>
-                      <w:b/>
-                      <w:bCs/>
-                      <w:sz w:val="20"/>
-                      <w:szCs w:val="20"/>
-                    </w:rPr>
-                    <w:t>isAus</w:t>
-                  </w:r>
-                  <w:proofErr w:type="spellEnd"/>
-                  <w:r>
-                    <w:rPr>
-                      <w:rFonts w:cstheme="minorHAnsi"/>
-                      <w:b/>
-                      <w:bCs/>
-                      <w:sz w:val="20"/>
-                      <w:szCs w:val="20"/>
-                    </w:rPr>
-                    <w:t>}Grade</w:t>
-                  </w:r>
-                  <w:proofErr w:type="gramEnd"/>
-                  <w:r>
-                    <w:rPr>
-                      <w:rFonts w:cstheme="minorHAnsi"/>
-                      <w:b/>
-                      <w:bCs/>
-                      <w:sz w:val="20"/>
-                      <w:szCs w:val="20"/>
-                    </w:rPr>
-                    <w:t>{/</w:t>
-                  </w:r>
-                  <w:proofErr w:type="spellStart"/>
-                  <w:r>
-                    <w:rPr>
-                      <w:rFonts w:cstheme="minorHAnsi"/>
-                      <w:b/>
-                      <w:bCs/>
-                      <w:sz w:val="20"/>
-                      <w:szCs w:val="20"/>
-                    </w:rPr>
-                    <w:t>isAus</w:t>
-                  </w:r>
-                  <w:proofErr w:type="spellEnd"/>
-                  <w:r>
-                    <w:rPr>
-                      <w:rFonts w:cstheme="minorHAnsi"/>
-                      <w:b/>
-                      <w:bCs/>
-                      <w:sz w:val="20"/>
-                      <w:szCs w:val="20"/>
-                    </w:rPr>
-                    <w:t>}</w:t>
+                    <w:t>{#isAus}ASW No{/isAus}{^isAus}Grade{/isAus}</w:t>
                   </w:r>
                 </w:p>
               </w:tc>
@@ -1921,32 +1744,8 @@
                       <w:sz w:val="20"/>
                       <w:szCs w:val="20"/>
                     </w:rPr>
-                    <w:t>{#</w:t>
-                  </w:r>
-                  <w:proofErr w:type="gramStart"/>
-                  <w:r>
-                    <w:rPr>
-                      <w:rFonts w:cstheme="minorHAnsi"/>
-                      <w:b/>
-                      <w:bCs/>
-                      <w:sz w:val="20"/>
-                      <w:szCs w:val="20"/>
-                    </w:rPr>
-                    <w:t>isAus}ASW</w:t>
-                  </w:r>
-                  <w:proofErr w:type="gramEnd"/>
-                  <w:r>
-                    <w:rPr>
-                      <w:rFonts w:cstheme="minorHAnsi"/>
-                      <w:b/>
-                      <w:bCs/>
-                      <w:sz w:val="20"/>
-                      <w:szCs w:val="20"/>
-                    </w:rPr>
-                    <w:t xml:space="preserve"> </w:t>
-                  </w:r>
-                  <w:proofErr w:type="spellStart"/>
-                  <w:proofErr w:type="gramStart"/>
+                    <w:t xml:space="preserve">{#isAus}ASW </w:t>
+                  </w:r>
                   <w:r>
                     <w:rPr>
                       <w:rFonts w:cstheme="minorHAnsi"/>
@@ -1965,76 +1764,7 @@
                       <w:sz w:val="20"/>
                       <w:szCs w:val="20"/>
                     </w:rPr>
-                    <w:t>No</w:t>
-                  </w:r>
-                  <w:proofErr w:type="spellEnd"/>
-                  <w:proofErr w:type="gramEnd"/>
-                  <w:r>
-                    <w:rPr>
-                      <w:rFonts w:cstheme="minorHAnsi"/>
-                      <w:b/>
-                      <w:bCs/>
-                      <w:sz w:val="20"/>
-                      <w:szCs w:val="20"/>
-                    </w:rPr>
-                    <w:t>{/</w:t>
-                  </w:r>
-                  <w:proofErr w:type="spellStart"/>
-                  <w:proofErr w:type="gramStart"/>
-                  <w:r>
-                    <w:rPr>
-                      <w:rFonts w:cstheme="minorHAnsi"/>
-                      <w:b/>
-                      <w:bCs/>
-                      <w:sz w:val="20"/>
-                      <w:szCs w:val="20"/>
-                    </w:rPr>
-                    <w:t>isAus</w:t>
-                  </w:r>
-                  <w:proofErr w:type="spellEnd"/>
-                  <w:r>
-                    <w:rPr>
-                      <w:rFonts w:cstheme="minorHAnsi"/>
-                      <w:b/>
-                      <w:bCs/>
-                      <w:sz w:val="20"/>
-                      <w:szCs w:val="20"/>
-                    </w:rPr>
-                    <w:t>}{</w:t>
-                  </w:r>
-                  <w:proofErr w:type="gramEnd"/>
-                  <w:r>
-                    <w:rPr>
-                      <w:rFonts w:cstheme="minorHAnsi"/>
-                      <w:b/>
-                      <w:bCs/>
-                      <w:sz w:val="20"/>
-                      <w:szCs w:val="20"/>
-                    </w:rPr>
-                    <w:t>^</w:t>
-                  </w:r>
-                  <w:proofErr w:type="spellStart"/>
-                  <w:proofErr w:type="gramStart"/>
-                  <w:r>
-                    <w:rPr>
-                      <w:rFonts w:cstheme="minorHAnsi"/>
-                      <w:b/>
-                      <w:bCs/>
-                      <w:sz w:val="20"/>
-                      <w:szCs w:val="20"/>
-                    </w:rPr>
-                    <w:t>isAus</w:t>
-                  </w:r>
-                  <w:proofErr w:type="spellEnd"/>
-                  <w:r>
-                    <w:rPr>
-                      <w:rFonts w:cstheme="minorHAnsi"/>
-                      <w:b/>
-                      <w:bCs/>
-                      <w:sz w:val="20"/>
-                      <w:szCs w:val="20"/>
-                    </w:rPr>
-                    <w:t>}</w:t>
+                    <w:t>No{/isAus}{^isAus}</w:t>
                   </w:r>
                   <w:r>
                     <w:rPr>
@@ -2046,38 +1776,15 @@
                     </w:rPr>
                     <w:t>Brand</w:t>
                   </w:r>
-                  <w:proofErr w:type="gramEnd"/>
-                  <w:r>
-                    <w:rPr>
-                      <w:rFonts w:cstheme="minorHAnsi"/>
-                      <w:b/>
-                      <w:bCs/>
-                      <w:sz w:val="20"/>
-                      <w:szCs w:val="20"/>
-                    </w:rPr>
-                    <w:t>{/</w:t>
-                  </w:r>
-                  <w:proofErr w:type="spellStart"/>
-                  <w:r>
-                    <w:rPr>
-                      <w:rFonts w:cstheme="minorHAnsi"/>
-                      <w:b/>
-                      <w:bCs/>
-                      <w:sz w:val="20"/>
-                      <w:szCs w:val="20"/>
-                    </w:rPr>
-                    <w:t>isAus</w:t>
-                  </w:r>
-                  <w:proofErr w:type="spellEnd"/>
-                  <w:r>
-                    <w:rPr>
-                      <w:rFonts w:cstheme="minorHAnsi"/>
-                      <w:b/>
-                      <w:bCs/>
-                      <w:sz w:val="20"/>
-                      <w:szCs w:val="20"/>
-                    </w:rPr>
-                    <w:t>}</w:t>
+                  <w:r>
+                    <w:rPr>
+                      <w:rFonts w:cstheme="minorHAnsi"/>
+                      <w:b/>
+                      <w:bCs/>
+                      <w:sz w:val="20"/>
+                      <w:szCs w:val="20"/>
+                    </w:rPr>
+                    <w:t>{/isAus}</w:t>
                   </w:r>
                 </w:p>
               </w:tc>
@@ -2200,7 +1907,6 @@
                       <w:szCs w:val="20"/>
                     </w:rPr>
                   </w:pPr>
-                  <w:proofErr w:type="spellStart"/>
                   <w:r>
                     <w:rPr>
                       <w:rFonts w:cstheme="minorHAnsi"/>
@@ -2211,7 +1917,6 @@
                     </w:rPr>
                     <w:t>NetWt</w:t>
                   </w:r>
-                  <w:proofErr w:type="spellEnd"/>
                   <w:r>
                     <w:rPr>
                       <w:rFonts w:cstheme="minorHAnsi"/>
@@ -2254,7 +1959,6 @@
                       <w:szCs w:val="20"/>
                     </w:rPr>
                   </w:pPr>
-                  <w:proofErr w:type="spellStart"/>
                   <w:r>
                     <w:rPr>
                       <w:rFonts w:cstheme="minorHAnsi"/>
@@ -2265,7 +1969,6 @@
                     </w:rPr>
                     <w:t>GrossWt</w:t>
                   </w:r>
-                  <w:proofErr w:type="spellEnd"/>
                   <w:r>
                     <w:rPr>
                       <w:rFonts w:cstheme="minorHAnsi"/>
@@ -2317,29 +2020,7 @@
                       <w:sz w:val="20"/>
                       <w:szCs w:val="20"/>
                     </w:rPr>
-                    <w:t xml:space="preserve">Box Size </w:t>
-                  </w:r>
-                  <w:proofErr w:type="gramStart"/>
-                  <w:r>
-                    <w:rPr>
-                      <w:rFonts w:cstheme="minorHAnsi"/>
-                      <w:b/>
-                      <w:bCs/>
-                      <w:sz w:val="20"/>
-                      <w:szCs w:val="20"/>
-                    </w:rPr>
-                    <w:t>In</w:t>
-                  </w:r>
-                  <w:proofErr w:type="gramEnd"/>
-                  <w:r>
-                    <w:rPr>
-                      <w:rFonts w:cstheme="minorHAnsi"/>
-                      <w:b/>
-                      <w:bCs/>
-                      <w:sz w:val="20"/>
-                      <w:szCs w:val="20"/>
-                    </w:rPr>
-                    <w:t xml:space="preserve"> Inch</w:t>
+                    <w:t>Box Size In Inch</w:t>
                   </w:r>
                 </w:p>
               </w:tc>
@@ -2377,7 +2058,6 @@
                     </w:rPr>
                     <w:t>{#</w:t>
                   </w:r>
-                  <w:proofErr w:type="gramStart"/>
                   <w:r>
                     <w:rPr>
                       <w:rFonts w:cstheme="minorHAnsi"/>
@@ -2400,18 +2080,8 @@
                       <w:sz w:val="20"/>
                       <w:szCs w:val="20"/>
                     </w:rPr>
-                    <w:t>{</w:t>
-                  </w:r>
-                  <w:proofErr w:type="gramEnd"/>
-                  <w:r>
-                    <w:rPr>
-                      <w:rFonts w:cstheme="minorHAnsi"/>
-                      <w:sz w:val="20"/>
-                      <w:szCs w:val="20"/>
-                    </w:rPr>
-                    <w:t>#</w:t>
-                  </w:r>
-                  <w:proofErr w:type="gramStart"/>
+                    <w:t>{#</w:t>
+                  </w:r>
                   <w:r>
                     <w:rPr>
                       <w:rFonts w:cstheme="minorHAnsi"/>
@@ -2436,18 +2106,7 @@
                       <w:sz w:val="20"/>
                       <w:szCs w:val="20"/>
                     </w:rPr>
-                    <w:t>{</w:t>
-                  </w:r>
-                  <w:proofErr w:type="gramEnd"/>
-                  <w:r>
-                    <w:rPr>
-                      <w:rFonts w:cstheme="minorHAnsi"/>
-                      <w:b/>
-                      <w:bCs/>
-                      <w:sz w:val="20"/>
-                      <w:szCs w:val="20"/>
-                    </w:rPr>
-                    <w:t>thic</w:t>
+                    <w:t>{thic</w:t>
                   </w:r>
                   <w:r>
                     <w:rPr>
@@ -2596,16 +2255,7 @@
                       <w:sz w:val="20"/>
                       <w:szCs w:val="20"/>
                     </w:rPr>
-                    <w:t>{#</w:t>
-                  </w:r>
-                  <w:proofErr w:type="gramStart"/>
-                  <w:r>
-                    <w:rPr>
-                      <w:rFonts w:cstheme="minorHAnsi"/>
-                      <w:sz w:val="20"/>
-                      <w:szCs w:val="20"/>
-                    </w:rPr>
-                    <w:t>invoices}</w:t>
+                    <w:t>{#invoices}</w:t>
                   </w:r>
                   <w:r>
                     <w:rPr>
@@ -2615,7 +2265,6 @@
                     </w:rPr>
                     <w:t>{</w:t>
                   </w:r>
-                  <w:proofErr w:type="gramEnd"/>
                   <w:r>
                     <w:rPr>
                       <w:rFonts w:cstheme="minorHAnsi"/>
@@ -2659,25 +2308,7 @@
                       <w:sz w:val="20"/>
                       <w:szCs w:val="20"/>
                     </w:rPr>
-                    <w:t>{</w:t>
-                  </w:r>
-                  <w:proofErr w:type="spellStart"/>
-                  <w:r>
-                    <w:rPr>
-                      <w:rFonts w:cstheme="minorHAnsi"/>
-                      <w:sz w:val="20"/>
-                      <w:szCs w:val="20"/>
-                    </w:rPr>
-                    <w:t>containerFrom</w:t>
-                  </w:r>
-                  <w:proofErr w:type="spellEnd"/>
-                  <w:r>
-                    <w:rPr>
-                      <w:rFonts w:cstheme="minorHAnsi"/>
-                      <w:sz w:val="20"/>
-                      <w:szCs w:val="20"/>
-                    </w:rPr>
-                    <w:t>}{#containerTo} to</w:t>
+                    <w:t>{containerFrom}{#containerTo} to</w:t>
                   </w:r>
                   <w:r>
                     <w:rPr>
@@ -2693,43 +2324,7 @@
                       <w:sz w:val="20"/>
                       <w:szCs w:val="20"/>
                     </w:rPr>
-                    <w:t>{</w:t>
-                  </w:r>
-                  <w:proofErr w:type="spellStart"/>
-                  <w:r>
-                    <w:rPr>
-                      <w:rFonts w:cstheme="minorHAnsi"/>
-                      <w:sz w:val="20"/>
-                      <w:szCs w:val="20"/>
-                    </w:rPr>
-                    <w:t>containerTo</w:t>
-                  </w:r>
-                  <w:proofErr w:type="spellEnd"/>
-                  <w:r>
-                    <w:rPr>
-                      <w:rFonts w:cstheme="minorHAnsi"/>
-                      <w:sz w:val="20"/>
-                      <w:szCs w:val="20"/>
-                    </w:rPr>
-                    <w:t>}{/</w:t>
-                  </w:r>
-                  <w:proofErr w:type="spellStart"/>
-                  <w:r>
-                    <w:rPr>
-                      <w:rFonts w:cstheme="minorHAnsi"/>
-                      <w:sz w:val="20"/>
-                      <w:szCs w:val="20"/>
-                    </w:rPr>
-                    <w:t>containerTo</w:t>
-                  </w:r>
-                  <w:proofErr w:type="spellEnd"/>
-                  <w:r>
-                    <w:rPr>
-                      <w:rFonts w:cstheme="minorHAnsi"/>
-                      <w:sz w:val="20"/>
-                      <w:szCs w:val="20"/>
-                    </w:rPr>
-                    <w:t>}</w:t>
+                    <w:t>{containerTo}{/containerTo}</w:t>
                   </w:r>
                 </w:p>
               </w:tc>
@@ -2760,7 +2355,6 @@
                     </w:rPr>
                     <w:t>{</w:t>
                   </w:r>
-                  <w:proofErr w:type="spellStart"/>
                   <w:r>
                     <w:rPr>
                       <w:rFonts w:cstheme="minorHAnsi"/>
@@ -2769,7 +2363,6 @@
                     </w:rPr>
                     <w:t>materialGrade</w:t>
                   </w:r>
-                  <w:proofErr w:type="spellEnd"/>
                 </w:p>
                 <w:p>
                   <w:pPr>
@@ -2817,7 +2410,6 @@
                     </w:rPr>
                     <w:t>{</w:t>
                   </w:r>
-                  <w:proofErr w:type="spellStart"/>
                   <w:r>
                     <w:rPr>
                       <w:rFonts w:cstheme="minorHAnsi"/>
@@ -2826,7 +2418,6 @@
                     </w:rPr>
                     <w:t>brandName</w:t>
                   </w:r>
-                  <w:proofErr w:type="spellEnd"/>
                   <w:r>
                     <w:rPr>
                       <w:rFonts w:cstheme="minorHAnsi"/>
@@ -2864,7 +2455,6 @@
                     </w:rPr>
                     <w:t>{</w:t>
                   </w:r>
-                  <w:proofErr w:type="spellStart"/>
                   <w:r>
                     <w:rPr>
                       <w:rFonts w:cstheme="minorHAnsi"/>
@@ -2873,7 +2463,6 @@
                     </w:rPr>
                     <w:t>designType</w:t>
                   </w:r>
-                  <w:proofErr w:type="spellEnd"/>
                   <w:r>
                     <w:rPr>
                       <w:rFonts w:cstheme="minorHAnsi"/>
@@ -2910,7 +2499,6 @@
                     </w:rPr>
                     <w:t>{</w:t>
                   </w:r>
-                  <w:proofErr w:type="spellStart"/>
                   <w:r>
                     <w:rPr>
                       <w:rFonts w:cstheme="minorHAnsi"/>
@@ -2919,7 +2507,6 @@
                     </w:rPr>
                     <w:t>finishType</w:t>
                   </w:r>
-                  <w:proofErr w:type="spellEnd"/>
                   <w:r>
                     <w:rPr>
                       <w:rFonts w:cstheme="minorHAnsi"/>
@@ -3002,7 +2589,6 @@
                     </w:rPr>
                     <w:t>{</w:t>
                   </w:r>
-                  <w:proofErr w:type="spellStart"/>
                   <w:r>
                     <w:rPr>
                       <w:rFonts w:cstheme="minorHAnsi"/>
@@ -3011,7 +2597,6 @@
                     </w:rPr>
                     <w:t>netWeight</w:t>
                   </w:r>
-                  <w:proofErr w:type="spellEnd"/>
                   <w:r>
                     <w:rPr>
                       <w:rFonts w:cstheme="minorHAnsi"/>
@@ -3049,7 +2634,6 @@
                     </w:rPr>
                     <w:t>{</w:t>
                   </w:r>
-                  <w:proofErr w:type="spellStart"/>
                   <w:r>
                     <w:rPr>
                       <w:rFonts w:cstheme="minorHAnsi"/>
@@ -3058,7 +2642,6 @@
                     </w:rPr>
                     <w:t>grossWeight</w:t>
                   </w:r>
-                  <w:proofErr w:type="spellEnd"/>
                   <w:r>
                     <w:rPr>
                       <w:rFonts w:cstheme="minorHAnsi"/>
@@ -3095,7 +2678,6 @@
                     </w:rPr>
                     <w:t>{</w:t>
                   </w:r>
-                  <w:proofErr w:type="spellStart"/>
                   <w:r>
                     <w:rPr>
                       <w:rFonts w:cstheme="minorHAnsi"/>
@@ -3104,7 +2686,6 @@
                     </w:rPr>
                     <w:t>lengthInch</w:t>
                   </w:r>
-                  <w:proofErr w:type="spellEnd"/>
                   <w:r>
                     <w:rPr>
                       <w:rFonts w:cstheme="minorHAnsi"/>
@@ -3113,7 +2694,6 @@
                     </w:rPr>
                     <w:t>} X {</w:t>
                   </w:r>
-                  <w:proofErr w:type="spellStart"/>
                   <w:r>
                     <w:rPr>
                       <w:rFonts w:cstheme="minorHAnsi"/>
@@ -3122,7 +2702,6 @@
                     </w:rPr>
                     <w:t>widthInch</w:t>
                   </w:r>
-                  <w:proofErr w:type="spellEnd"/>
                   <w:r>
                     <w:rPr>
                       <w:rFonts w:cstheme="minorHAnsi"/>
@@ -3131,7 +2710,6 @@
                     </w:rPr>
                     <w:t>} X {</w:t>
                   </w:r>
-                  <w:proofErr w:type="spellStart"/>
                   <w:r>
                     <w:rPr>
                       <w:rFonts w:cstheme="minorHAnsi"/>
@@ -3146,16 +2724,7 @@
                       <w:sz w:val="20"/>
                       <w:szCs w:val="20"/>
                     </w:rPr>
-                    <w:t>h</w:t>
-                  </w:r>
-                  <w:proofErr w:type="spellEnd"/>
-                  <w:r>
-                    <w:rPr>
-                      <w:rFonts w:cstheme="minorHAnsi"/>
-                      <w:sz w:val="20"/>
-                      <w:szCs w:val="20"/>
-                    </w:rPr>
-                    <w:t>}</w:t>
+                    <w:t>h}</w:t>
                   </w:r>
                   <w:r>
                     <w:rPr>
@@ -3171,43 +2740,7 @@
                       <w:sz w:val="20"/>
                       <w:szCs w:val="20"/>
                     </w:rPr>
-                    <w:t>{/</w:t>
-                  </w:r>
-                  <w:proofErr w:type="gramStart"/>
-                  <w:r>
-                    <w:rPr>
-                      <w:rFonts w:cstheme="minorHAnsi"/>
-                      <w:sz w:val="20"/>
-                      <w:szCs w:val="20"/>
-                    </w:rPr>
-                    <w:t>invoices}{</w:t>
-                  </w:r>
-                  <w:proofErr w:type="gramEnd"/>
-                  <w:r>
-                    <w:rPr>
-                      <w:rFonts w:cstheme="minorHAnsi"/>
-                      <w:sz w:val="20"/>
-                      <w:szCs w:val="20"/>
-                    </w:rPr>
-                    <w:t>/</w:t>
-                  </w:r>
-                  <w:proofErr w:type="spellStart"/>
-                  <w:r>
-                    <w:rPr>
-                      <w:rFonts w:cstheme="minorHAnsi"/>
-                      <w:sz w:val="20"/>
-                      <w:szCs w:val="20"/>
-                    </w:rPr>
-                    <w:t>invoiceItems</w:t>
-                  </w:r>
-                  <w:proofErr w:type="spellEnd"/>
-                  <w:r>
-                    <w:rPr>
-                      <w:rFonts w:cstheme="minorHAnsi"/>
-                      <w:sz w:val="20"/>
-                      <w:szCs w:val="20"/>
-                    </w:rPr>
-                    <w:t>}</w:t>
+                    <w:t>{/invoices}{/invoiceItems}</w:t>
                   </w:r>
                 </w:p>
               </w:tc>
@@ -3348,7 +2881,6 @@
                     </w:rPr>
                     <w:t>{</w:t>
                   </w:r>
-                  <w:proofErr w:type="spellStart"/>
                   <w:r>
                     <w:rPr>
                       <w:rFonts w:cstheme="minorHAnsi"/>
@@ -3359,7 +2891,6 @@
                     </w:rPr>
                     <w:t>totalQuantity</w:t>
                   </w:r>
-                  <w:proofErr w:type="spellEnd"/>
                   <w:r>
                     <w:rPr>
                       <w:rFonts w:cstheme="minorHAnsi"/>
@@ -3434,29 +2965,7 @@
                       <w:sz w:val="20"/>
                       <w:szCs w:val="20"/>
                     </w:rPr>
-                    <w:t>{</w:t>
-                  </w:r>
-                  <w:proofErr w:type="spellStart"/>
-                  <w:r>
-                    <w:rPr>
-                      <w:rFonts w:cstheme="minorHAnsi"/>
-                      <w:b/>
-                      <w:bCs/>
-                      <w:sz w:val="20"/>
-                      <w:szCs w:val="20"/>
-                    </w:rPr>
-                    <w:t>totalBox</w:t>
-                  </w:r>
-                  <w:proofErr w:type="spellEnd"/>
-                  <w:r>
-                    <w:rPr>
-                      <w:rFonts w:cstheme="minorHAnsi"/>
-                      <w:b/>
-                      <w:bCs/>
-                      <w:sz w:val="20"/>
-                      <w:szCs w:val="20"/>
-                    </w:rPr>
-                    <w:t>}</w:t>
+                    <w:t>{totalBox}</w:t>
                   </w:r>
                 </w:p>
               </w:tc>
@@ -3544,7 +3053,6 @@
                     </w:rPr>
                     <w:t>{</w:t>
                   </w:r>
-                  <w:proofErr w:type="spellStart"/>
                   <w:r>
                     <w:rPr>
                       <w:rFonts w:cstheme="minorHAnsi"/>
@@ -3555,7 +3063,6 @@
                     </w:rPr>
                     <w:t>totalNetWeight</w:t>
                   </w:r>
-                  <w:proofErr w:type="spellEnd"/>
                   <w:r>
                     <w:rPr>
                       <w:rFonts w:cstheme="minorHAnsi"/>
@@ -3651,7 +3158,6 @@
                     </w:rPr>
                     <w:t>{</w:t>
                   </w:r>
-                  <w:proofErr w:type="spellStart"/>
                   <w:r>
                     <w:rPr>
                       <w:rFonts w:cstheme="minorHAnsi"/>
@@ -3662,7 +3168,6 @@
                     </w:rPr>
                     <w:t>totalGrossWeight</w:t>
                   </w:r>
-                  <w:proofErr w:type="spellEnd"/>
                   <w:r>
                     <w:rPr>
                       <w:rFonts w:cstheme="minorHAnsi"/>
@@ -3698,50 +3203,49 @@
                 <w:p>
                   <w:pPr>
                     <w:pStyle w:val="NoSpacing"/>
-                    <w:keepNext/>
                     <w:framePr w:hSpace="180" w:wrap="around" w:vAnchor="page" w:hAnchor="margin" w:y="481"/>
                     <w:spacing w:line="276" w:lineRule="auto"/>
                     <w:rPr>
                       <w:rFonts w:cstheme="minorHAnsi"/>
-                      <w:b/>
-                      <w:bCs/>
-                      <w:sz w:val="20"/>
-                      <w:szCs w:val="20"/>
                     </w:rPr>
                   </w:pPr>
                   <w:r>
                     <w:rPr>
                       <w:rFonts w:cstheme="minorHAnsi"/>
-                      <w:b/>
-                      <w:bCs/>
-                      <w:sz w:val="20"/>
-                      <w:szCs w:val="20"/>
-                    </w:rPr>
-                    <w:t xml:space="preserve">Total </w:t>
-                  </w:r>
-                  <w:proofErr w:type="spellStart"/>
-                  <w:proofErr w:type="gramStart"/>
-                  <w:r>
-                    <w:rPr>
-                      <w:rFonts w:cstheme="minorHAnsi"/>
-                      <w:b/>
-                      <w:bCs/>
-                      <w:sz w:val="20"/>
-                      <w:szCs w:val="20"/>
-                    </w:rPr>
-                    <w:t>Sq.Meter</w:t>
-                  </w:r>
-                  <w:proofErr w:type="spellEnd"/>
-                  <w:proofErr w:type="gramEnd"/>
-                  <w:r>
-                    <w:rPr>
-                      <w:rFonts w:cstheme="minorHAnsi"/>
-                      <w:b/>
-                      <w:bCs/>
-                      <w:sz w:val="20"/>
-                      <w:szCs w:val="20"/>
-                    </w:rPr>
-                    <w:t>:</w:t>
+                    </w:rPr>
+                    <w:t>{</w:t>
+                  </w:r>
+                  <w:r>
+                    <w:rPr>
+                      <w:rFonts w:cstheme="minorHAnsi"/>
+                    </w:rPr>
+                    <w:t>^</w:t>
+                  </w:r>
+                  <w:r>
+                    <w:rPr>
+                      <w:rFonts w:cstheme="minorHAnsi"/>
+                      <w:b/>
+                      <w:bCs/>
+                      <w:sz w:val="20"/>
+                      <w:szCs w:val="20"/>
+                    </w:rPr>
+                    <w:t>isAus</w:t>
+                  </w:r>
+                  <w:r>
+                    <w:rPr>
+                      <w:rFonts w:cstheme="minorHAnsi"/>
+                    </w:rPr>
+                    <w:t>}</w:t>
+                  </w:r>
+                  <w:r>
+                    <w:rPr>
+                      <w:rFonts w:cstheme="minorHAnsi"/>
+                      <w:b/>
+                      <w:bCs/>
+                      <w:sz w:val="20"/>
+                      <w:szCs w:val="20"/>
+                    </w:rPr>
+                    <w:t>Total Sq.Meter:</w:t>
                   </w:r>
                 </w:p>
               </w:tc>
@@ -3752,7 +3256,6 @@
                 <w:p>
                   <w:pPr>
                     <w:pStyle w:val="NoSpacing"/>
-                    <w:keepNext/>
                     <w:spacing w:line="276" w:lineRule="auto"/>
                     <w:rPr>
                       <w:rFonts w:cstheme="minorHAnsi"/>
@@ -3770,39 +3273,53 @@
                       <w:sz w:val="20"/>
                       <w:szCs w:val="20"/>
                     </w:rPr>
+                    <w:t xml:space="preserve">{totalSqMt} </w:t>
+                  </w:r>
+                  <w:r>
+                    <w:rPr>
+                      <w:rFonts w:cstheme="minorHAnsi"/>
+                      <w:b/>
+                      <w:bCs/>
+                      <w:sz w:val="20"/>
+                      <w:szCs w:val="20"/>
+                    </w:rPr>
+                    <w:t>MM</w:t>
+                  </w:r>
+                  <w:r>
+                    <w:rPr>
+                      <w:rFonts w:cstheme="minorHAnsi"/>
+                      <w:b/>
+                      <w:bCs/>
+                      <w:sz w:val="20"/>
+                      <w:szCs w:val="20"/>
+                    </w:rPr>
                     <w:t>{</w:t>
                   </w:r>
-                  <w:proofErr w:type="spellStart"/>
-                  <w:r>
-                    <w:rPr>
-                      <w:rFonts w:cstheme="minorHAnsi"/>
-                      <w:b/>
-                      <w:bCs/>
-                      <w:sz w:val="20"/>
-                      <w:szCs w:val="20"/>
-                    </w:rPr>
-                    <w:t>totalSqMt</w:t>
-                  </w:r>
-                  <w:proofErr w:type="spellEnd"/>
-                  <w:r>
-                    <w:rPr>
-                      <w:rFonts w:cstheme="minorHAnsi"/>
-                      <w:b/>
-                      <w:bCs/>
-                      <w:sz w:val="20"/>
-                      <w:szCs w:val="20"/>
-                    </w:rPr>
-                    <w:t xml:space="preserve">} </w:t>
-                  </w:r>
-                  <w:r>
-                    <w:rPr>
-                      <w:rFonts w:cstheme="minorHAnsi"/>
-                      <w:b/>
-                      <w:bCs/>
-                      <w:sz w:val="20"/>
-                      <w:szCs w:val="20"/>
-                    </w:rPr>
-                    <w:t>MM</w:t>
+                  <w:r>
+                    <w:rPr>
+                      <w:rFonts w:cstheme="minorHAnsi"/>
+                    </w:rPr>
+                    <w:t>/</w:t>
+                  </w:r>
+                  <w:r>
+                    <w:rPr>
+                      <w:rFonts w:cstheme="minorHAnsi"/>
+                      <w:b/>
+                      <w:bCs/>
+                      <w:sz w:val="20"/>
+                      <w:szCs w:val="20"/>
+                    </w:rPr>
+                    <w:t>isAus</w:t>
+                  </w:r>
+                  <w:r>
+                    <w:rPr>
+                      <w:rFonts w:cstheme="minorHAnsi"/>
+                      <w:b/>
+                      <w:bCs/>
+                      <w:sz w:val="20"/>
+                      <w:szCs w:val="20"/>
+                    </w:rPr>
+                    <w:t>}</w:t>
                   </w:r>
                 </w:p>
               </w:tc>
@@ -3853,7 +3370,7 @@
               <w:tblLook w:val="04A0" w:firstRow="1" w:lastRow="0" w:firstColumn="1" w:lastColumn="0" w:noHBand="0" w:noVBand="1"/>
             </w:tblPr>
             <w:tblGrid>
-              <w:gridCol w:w="3083"/>
+              <w:gridCol w:w="3736"/>
               <w:gridCol w:w="1876"/>
               <w:gridCol w:w="3731"/>
             </w:tblGrid>
@@ -3880,61 +3397,37 @@
                       <w:szCs w:val="20"/>
                     </w:rPr>
                   </w:pPr>
-                  <w:proofErr w:type="spellStart"/>
-                  <w:r>
-                    <w:rPr>
-                      <w:rFonts w:cstheme="minorHAnsi"/>
-                      <w:b/>
-                      <w:bCs/>
-                      <w:sz w:val="20"/>
-                      <w:szCs w:val="20"/>
-                    </w:rPr>
-                    <w:t>Avg</w:t>
-                  </w:r>
-                  <w:proofErr w:type="spellEnd"/>
-                  <w:r>
-                    <w:rPr>
-                      <w:rFonts w:cstheme="minorHAnsi"/>
-                      <w:b/>
-                      <w:bCs/>
-                      <w:sz w:val="20"/>
-                      <w:szCs w:val="20"/>
-                    </w:rPr>
-                    <w:t>/</w:t>
-                  </w:r>
-                  <w:proofErr w:type="spellStart"/>
-                  <w:proofErr w:type="gramStart"/>
-                  <w:r>
-                    <w:rPr>
-                      <w:rFonts w:cstheme="minorHAnsi"/>
-                      <w:b/>
-                      <w:bCs/>
-                      <w:sz w:val="20"/>
-                      <w:szCs w:val="20"/>
-                    </w:rPr>
-                    <w:t>Wt</w:t>
-                  </w:r>
-                  <w:proofErr w:type="spellEnd"/>
-                  <w:r>
-                    <w:rPr>
-                      <w:rFonts w:cstheme="minorHAnsi"/>
-                      <w:b/>
-                      <w:bCs/>
-                      <w:sz w:val="20"/>
-                      <w:szCs w:val="20"/>
-                    </w:rPr>
-                    <w:t>(</w:t>
-                  </w:r>
-                  <w:proofErr w:type="gramEnd"/>
-                  <w:r>
-                    <w:rPr>
-                      <w:rFonts w:cstheme="minorHAnsi"/>
-                      <w:b/>
-                      <w:bCs/>
-                      <w:sz w:val="20"/>
-                      <w:szCs w:val="20"/>
-                    </w:rPr>
-                    <w:t>Kg)</w:t>
+                  <w:r>
+                    <w:rPr>
+                      <w:rFonts w:cstheme="minorHAnsi"/>
+                    </w:rPr>
+                    <w:t>{^</w:t>
+                  </w:r>
+                  <w:r>
+                    <w:rPr>
+                      <w:rFonts w:cstheme="minorHAnsi"/>
+                      <w:b/>
+                      <w:bCs/>
+                      <w:sz w:val="20"/>
+                      <w:szCs w:val="20"/>
+                    </w:rPr>
+                    <w:t>isAus</w:t>
+                  </w:r>
+                  <w:r>
+                    <w:rPr>
+                      <w:rFonts w:cstheme="minorHAnsi"/>
+                    </w:rPr>
+                    <w:t>}</w:t>
+                  </w:r>
+                  <w:r>
+                    <w:rPr>
+                      <w:rFonts w:cstheme="minorHAnsi"/>
+                      <w:b/>
+                      <w:bCs/>
+                      <w:sz w:val="20"/>
+                      <w:szCs w:val="20"/>
+                    </w:rPr>
+                    <w:t>Avg/Wt(Kg)</w:t>
                   </w:r>
                 </w:p>
               </w:tc>
@@ -3995,6 +3488,34 @@
                       <w:szCs w:val="20"/>
                     </w:rPr>
                     <w:t>Size</w:t>
+                  </w:r>
+                  <w:r>
+                    <w:rPr>
+                      <w:rFonts w:cstheme="minorHAnsi"/>
+                    </w:rPr>
+                    <w:t>{</w:t>
+                  </w:r>
+                  <w:r>
+                    <w:rPr>
+                      <w:rFonts w:cstheme="minorHAnsi"/>
+                    </w:rPr>
+                    <w:t>/i</w:t>
+                  </w:r>
+                  <w:r>
+                    <w:rPr>
+                      <w:rFonts w:cstheme="minorHAnsi"/>
+                      <w:b/>
+                      <w:bCs/>
+                      <w:sz w:val="20"/>
+                      <w:szCs w:val="20"/>
+                    </w:rPr>
+                    <w:t>sAus</w:t>
+                  </w:r>
+                  <w:r>
+                    <w:rPr>
+                      <w:rFonts w:cstheme="minorHAnsi"/>
+                    </w:rPr>
+                    <w:t>}</w:t>
                   </w:r>
                 </w:p>
               </w:tc>
@@ -4025,34 +3546,34 @@
                   <w:r>
                     <w:rPr>
                       <w:rFonts w:cstheme="minorHAnsi"/>
-                      <w:b/>
-                      <w:bCs/>
-                      <w:sz w:val="20"/>
-                      <w:szCs w:val="20"/>
-                    </w:rPr>
-                    <w:t>{#</w:t>
-                  </w:r>
-                  <w:proofErr w:type="gramStart"/>
-                  <w:r>
-                    <w:rPr>
-                      <w:rFonts w:cstheme="minorHAnsi"/>
-                      <w:b/>
-                      <w:bCs/>
-                      <w:sz w:val="20"/>
-                      <w:szCs w:val="20"/>
-                    </w:rPr>
-                    <w:t>containerSummary}{</w:t>
-                  </w:r>
-                  <w:proofErr w:type="gramEnd"/>
-                  <w:r>
-                    <w:rPr>
-                      <w:rFonts w:cstheme="minorHAnsi"/>
-                      <w:b/>
-                      <w:bCs/>
-                      <w:sz w:val="20"/>
-                      <w:szCs w:val="20"/>
-                    </w:rPr>
-                    <w:t>avgWeight}</w:t>
+                    </w:rPr>
+                    <w:t>{^</w:t>
+                  </w:r>
+                  <w:r>
+                    <w:rPr>
+                      <w:rFonts w:cstheme="minorHAnsi"/>
+                      <w:b/>
+                      <w:bCs/>
+                      <w:sz w:val="20"/>
+                      <w:szCs w:val="20"/>
+                    </w:rPr>
+                    <w:t>isAus</w:t>
+                  </w:r>
+                  <w:r>
+                    <w:rPr>
+                      <w:rFonts w:cstheme="minorHAnsi"/>
+                    </w:rPr>
+                    <w:t>}</w:t>
+                  </w:r>
+                  <w:r>
+                    <w:rPr>
+                      <w:rFonts w:cstheme="minorHAnsi"/>
+                      <w:b/>
+                      <w:bCs/>
+                      <w:sz w:val="20"/>
+                      <w:szCs w:val="20"/>
+                    </w:rPr>
+                    <w:t>{#containerSummary}{avgWeight}</w:t>
                   </w:r>
                 </w:p>
               </w:tc>
@@ -4082,29 +3603,7 @@
                       <w:sz w:val="20"/>
                       <w:szCs w:val="20"/>
                     </w:rPr>
-                    <w:t>{</w:t>
-                  </w:r>
-                  <w:proofErr w:type="spellStart"/>
-                  <w:r>
-                    <w:rPr>
-                      <w:rFonts w:cstheme="minorHAnsi"/>
-                      <w:b/>
-                      <w:bCs/>
-                      <w:sz w:val="20"/>
-                      <w:szCs w:val="20"/>
-                    </w:rPr>
-                    <w:t>totalSqMtPerType</w:t>
-                  </w:r>
-                  <w:proofErr w:type="spellEnd"/>
-                  <w:r>
-                    <w:rPr>
-                      <w:rFonts w:cstheme="minorHAnsi"/>
-                      <w:b/>
-                      <w:bCs/>
-                      <w:sz w:val="20"/>
-                      <w:szCs w:val="20"/>
-                    </w:rPr>
-                    <w:t>}</w:t>
+                    <w:t>{totalSqMtPerType}</w:t>
                   </w:r>
                 </w:p>
               </w:tc>
@@ -4134,27 +3633,33 @@
                       <w:sz w:val="20"/>
                       <w:szCs w:val="20"/>
                     </w:rPr>
-                    <w:t>{length} X {width} X {height} MM{/</w:t>
-                  </w:r>
-                  <w:proofErr w:type="spellStart"/>
-                  <w:r>
-                    <w:rPr>
-                      <w:rFonts w:cstheme="minorHAnsi"/>
-                      <w:b/>
-                      <w:bCs/>
-                      <w:sz w:val="20"/>
-                      <w:szCs w:val="20"/>
-                    </w:rPr>
-                    <w:t>containerSummary</w:t>
-                  </w:r>
-                  <w:proofErr w:type="spellEnd"/>
-                  <w:r>
-                    <w:rPr>
-                      <w:rFonts w:cstheme="minorHAnsi"/>
-                      <w:b/>
-                      <w:bCs/>
-                      <w:sz w:val="20"/>
-                      <w:szCs w:val="20"/>
+                    <w:t>{length} X {width} X {height} MM{/containerSummary}</w:t>
+                  </w:r>
+                  <w:r>
+                    <w:rPr>
+                      <w:rFonts w:cstheme="minorHAnsi"/>
+                    </w:rPr>
+                    <w:t>{</w:t>
+                  </w:r>
+                  <w:r>
+                    <w:rPr>
+                      <w:rFonts w:cstheme="minorHAnsi"/>
+                    </w:rPr>
+                    <w:t>/</w:t>
+                  </w:r>
+                  <w:r>
+                    <w:rPr>
+                      <w:rFonts w:cstheme="minorHAnsi"/>
+                      <w:b/>
+                      <w:bCs/>
+                      <w:sz w:val="20"/>
+                      <w:szCs w:val="20"/>
+                    </w:rPr>
+                    <w:t>isAus</w:t>
+                  </w:r>
+                  <w:r>
+                    <w:rPr>
+                      <w:rFonts w:cstheme="minorHAnsi"/>
                     </w:rPr>
                     <w:t>}</w:t>
                   </w:r>
@@ -4162,35 +3667,6 @@
               </w:tc>
             </w:tr>
           </w:tbl>
-          <w:p>
-            <w:pPr>
-              <w:pStyle w:val="NoSpacing"/>
-              <w:spacing w:line="276" w:lineRule="auto"/>
-              <w:rPr>
-                <w:rFonts w:cstheme="minorHAnsi"/>
-                <w:sz w:val="20"/>
-                <w:szCs w:val="20"/>
-              </w:rPr>
-            </w:pPr>
-          </w:p>
-        </w:tc>
-      </w:tr>
-      <w:tr>
-        <w:trPr>
-          <w:cantSplit/>
-          <w:trHeight w:val="298"/>
-        </w:trPr>
-        <w:tc>
-          <w:tcPr>
-            <w:tcW w:w="11106" w:type="dxa"/>
-            <w:gridSpan w:val="4"/>
-            <w:tcBorders>
-              <w:top w:val="nil"/>
-              <w:left w:val="nil"/>
-              <w:bottom w:val="nil"/>
-              <w:right w:val="nil"/>
-            </w:tcBorders>
-          </w:tcPr>
           <w:p>
             <w:pPr>
               <w:pStyle w:val="NoSpacing"/>

</xml_diff>

<commit_message>
group by box size , invoicedetails ,bottomnote & instructions editable,box size inch dynamic according to size,removed bank details fields
</commit_message>
<xml_diff>
--- a/electron/database/generate-document/templates/custom-packing.docx
+++ b/electron/database/generate-document/templates/custom-packing.docx
@@ -10,10 +10,10 @@
         <w:tblLook w:val="04A0" w:firstRow="1" w:lastRow="0" w:firstColumn="1" w:lastColumn="0" w:noHBand="0" w:noVBand="1"/>
       </w:tblPr>
       <w:tblGrid>
-        <w:gridCol w:w="4116"/>
-        <w:gridCol w:w="2280"/>
-        <w:gridCol w:w="2406"/>
-        <w:gridCol w:w="2304"/>
+        <w:gridCol w:w="4107"/>
+        <w:gridCol w:w="2283"/>
+        <w:gridCol w:w="2409"/>
+        <w:gridCol w:w="2307"/>
       </w:tblGrid>
       <w:tr>
         <w:trPr>
@@ -1784,15 +1784,15 @@
               <w:tblLook w:val="04A0" w:firstRow="1" w:lastRow="0" w:firstColumn="1" w:lastColumn="0" w:noHBand="0" w:noVBand="1"/>
             </w:tblPr>
             <w:tblGrid>
-              <w:gridCol w:w="3036"/>
-              <w:gridCol w:w="1505"/>
-              <w:gridCol w:w="1639"/>
-              <w:gridCol w:w="656"/>
-              <w:gridCol w:w="619"/>
-              <w:gridCol w:w="560"/>
-              <w:gridCol w:w="630"/>
-              <w:gridCol w:w="695"/>
-              <w:gridCol w:w="1550"/>
+              <w:gridCol w:w="3075"/>
+              <w:gridCol w:w="1524"/>
+              <w:gridCol w:w="1659"/>
+              <w:gridCol w:w="662"/>
+              <w:gridCol w:w="625"/>
+              <w:gridCol w:w="565"/>
+              <w:gridCol w:w="636"/>
+              <w:gridCol w:w="702"/>
+              <w:gridCol w:w="1442"/>
             </w:tblGrid>
             <w:tr>
               <w:trPr>
@@ -2553,15 +2553,7 @@
                       <w:sz w:val="18"/>
                       <w:szCs w:val="18"/>
                     </w:rPr>
-                    <w:t>/</w:t>
-                  </w:r>
-                  <w:r>
-                    <w:rPr>
-                      <w:rFonts w:cstheme="minorHAnsi"/>
-                      <w:sz w:val="18"/>
-                      <w:szCs w:val="18"/>
-                    </w:rPr>
-                    <w:t>{/</w:t>
+                    <w:t>/{/</w:t>
                   </w:r>
                   <w:r>
                     <w:rPr>
@@ -2978,7 +2970,7 @@
                       <w:sz w:val="18"/>
                       <w:szCs w:val="18"/>
                     </w:rPr>
-                    <w:t>lengthInch</w:t>
+                    <w:t>sizeInch</w:t>
                   </w:r>
                   <w:proofErr w:type="spellEnd"/>
                   <w:r>
@@ -2987,43 +2979,15 @@
                       <w:sz w:val="18"/>
                       <w:szCs w:val="18"/>
                     </w:rPr>
-                    <w:t>} X {</w:t>
-                  </w:r>
-                  <w:proofErr w:type="spellStart"/>
+                    <w:t>}</w:t>
+                  </w:r>
                   <w:r>
                     <w:rPr>
                       <w:rFonts w:cstheme="minorHAnsi"/>
                       <w:sz w:val="18"/>
                       <w:szCs w:val="18"/>
                     </w:rPr>
-                    <w:t>widthInch</w:t>
-                  </w:r>
-                  <w:proofErr w:type="spellEnd"/>
-                  <w:r>
-                    <w:rPr>
-                      <w:rFonts w:cstheme="minorHAnsi"/>
-                      <w:sz w:val="18"/>
-                      <w:szCs w:val="18"/>
-                    </w:rPr>
-                    <w:t>} X {</w:t>
-                  </w:r>
-                  <w:proofErr w:type="spellStart"/>
-                  <w:r>
-                    <w:rPr>
-                      <w:rFonts w:cstheme="minorHAnsi"/>
-                      <w:sz w:val="18"/>
-                      <w:szCs w:val="18"/>
-                    </w:rPr>
-                    <w:t>heightInch</w:t>
-                  </w:r>
-                  <w:proofErr w:type="spellEnd"/>
-                  <w:r>
-                    <w:rPr>
-                      <w:rFonts w:cstheme="minorHAnsi"/>
-                      <w:sz w:val="18"/>
-                      <w:szCs w:val="18"/>
-                    </w:rPr>
-                    <w:t>}"{/invoices}{/</w:t>
+                    <w:t>{/invoices}{/</w:t>
                   </w:r>
                   <w:proofErr w:type="spellStart"/>
                   <w:r>
@@ -5074,7 +5038,6 @@
   <w:style w:type="character" w:default="1" w:styleId="DefaultParagraphFont">
     <w:name w:val="Default Paragraph Font"/>
     <w:uiPriority w:val="1"/>
-    <w:semiHidden/>
     <w:unhideWhenUsed/>
   </w:style>
   <w:style w:type="table" w:default="1" w:styleId="TableNormal">

</xml_diff>